<commit_message>
Update 3MF Editor Build Instructions for VSCode.docx
</commit_message>
<xml_diff>
--- a/Documentation/3MF Editor Build Instructions for VSCode.docx
+++ b/Documentation/3MF Editor Build Instructions for VSCode.docx
@@ -188,10 +188,7 @@
         <w:t>Run Without Debugging</w:t>
       </w:r>
       <w:r>
-        <w:t xml:space="preserve"> and </w:t>
-      </w:r>
-      <w:r>
-        <w:t>, select “Java” as debugger.</w:t>
+        <w:t xml:space="preserve"> and select “Java” as debugger.</w:t>
       </w:r>
       <w:r>
         <w:t xml:space="preserve"> It will execute the “3MF Edit and Test” tool.</w:t>
@@ -280,6 +277,9 @@
         <w:ind w:left="720"/>
       </w:pPr>
       <w:r>
+        <w:rPr>
+          <w:noProof/>
+        </w:rPr>
         <w:drawing>
           <wp:inline distT="0" distB="0" distL="0" distR="0" wp14:anchorId="54399C1A" wp14:editId="7DAEB5FE">
             <wp:extent cx="2314898" cy="3343742"/>
@@ -337,6 +337,9 @@
         <w:pStyle w:val="ListParagraph"/>
       </w:pPr>
       <w:r>
+        <w:rPr>
+          <w:noProof/>
+        </w:rPr>
         <w:drawing>
           <wp:inline distT="0" distB="0" distL="0" distR="0" wp14:anchorId="187CDBD2" wp14:editId="39FEA01B">
             <wp:extent cx="5943600" cy="1344295"/>
@@ -397,6 +400,9 @@
         <w:pStyle w:val="ListParagraph"/>
       </w:pPr>
       <w:r>
+        <w:rPr>
+          <w:noProof/>
+        </w:rPr>
         <w:lastRenderedPageBreak/>
         <w:drawing>
           <wp:inline distT="0" distB="0" distL="0" distR="0" wp14:anchorId="1ED37D84" wp14:editId="3D9203C5">

</xml_diff>